<commit_message>
Pantalla sin iconos, guion y README actualizados, informe final con capturas de la demo
</commit_message>
<xml_diff>
--- a/docs/Hito2_Grupo04_DevSecOps.docx
+++ b/docs/Hito2_Grupo04_DevSecOps.docx
@@ -104,7 +104,10 @@
     </w:p>
     <w:p>
       <w:pPr>
-        <w:pStyle w:val="Prrafodelista"/>
+        <w:numPr>
+          <w:ilvl w:val="0"/>
+          <w:numId w:val="2"/>
+        </w:numPr>
       </w:pPr>
       <w:r>
         <w:t>Venden cosas que ya no hay y se dan cuenta cuando el pedido ya va en camino.</w:t>
@@ -112,7 +115,10 @@
     </w:p>
     <w:p>
       <w:pPr>
-        <w:pStyle w:val="Prrafodelista"/>
+        <w:numPr>
+          <w:ilvl w:val="0"/>
+          <w:numId w:val="2"/>
+        </w:numPr>
       </w:pPr>
       <w:r>
         <w:t>El precio lo dicen de memoria, entonces a veces cobran de más o de menos.</w:t>
@@ -120,7 +126,10 @@
     </w:p>
     <w:p>
       <w:pPr>
-        <w:pStyle w:val="Prrafodelista"/>
+        <w:numPr>
+          <w:ilvl w:val="0"/>
+          <w:numId w:val="2"/>
+        </w:numPr>
       </w:pPr>
       <w:r>
         <w:t>Los medicamentos controlados (clonazepam, tramadol, antibióticos) solo se pueden vender con receta y nadie anota el número de receta. Si llega una inspección no tienen cómo demostrarlo.</w:t>
@@ -624,7 +633,10 @@
     </w:p>
     <w:p>
       <w:pPr>
-        <w:pStyle w:val="Prrafodelista"/>
+        <w:numPr>
+          <w:ilvl w:val="0"/>
+          <w:numId w:val="2"/>
+        </w:numPr>
       </w:pPr>
       <w:r>
         <w:t>Si piden 2 cajas de acetaminofén, el sistema registra la venta por Q17.00 y descuenta 2.</w:t>
@@ -632,7 +644,10 @@
     </w:p>
     <w:p>
       <w:pPr>
-        <w:pStyle w:val="Prrafodelista"/>
+        <w:numPr>
+          <w:ilvl w:val="0"/>
+          <w:numId w:val="2"/>
+        </w:numPr>
       </w:pPr>
       <w:r>
         <w:t>Si piden clonazepam sin receta, el sistema no deja registrarlo y avisa que necesita receta.</w:t>
@@ -646,7 +661,10 @@
     </w:p>
     <w:p>
       <w:pPr>
-        <w:pStyle w:val="Prrafodelista"/>
+        <w:numPr>
+          <w:ilvl w:val="0"/>
+          <w:numId w:val="2"/>
+        </w:numPr>
       </w:pPr>
       <w:r>
         <w:t>Si alguien agrega una librería con una vulnerabilidad alta, el pipeline falla y no se construye nada.</w:t>
@@ -654,7 +672,10 @@
     </w:p>
     <w:p>
       <w:pPr>
-        <w:pStyle w:val="Prrafodelista"/>
+        <w:numPr>
+          <w:ilvl w:val="0"/>
+          <w:numId w:val="2"/>
+        </w:numPr>
       </w:pPr>
       <w:r>
         <w:t>Si alguien deja una contraseña o llave en el código, el pipeline la detecta y se detiene.</w:t>
@@ -1176,7 +1197,7 @@
       <w:r>
         <w:drawing>
           <wp:inline xmlns:a="http://schemas.openxmlformats.org/drawingml/2006/main" xmlns:pic="http://schemas.openxmlformats.org/drawingml/2006/picture">
-            <wp:extent cx="5400000" cy="2442962"/>
+            <wp:extent cx="5400000" cy="2121754"/>
             <wp:docPr id="1" name="Picture 1"/>
             <wp:cNvGraphicFramePr>
               <a:graphicFrameLocks noChangeAspect="1"/>
@@ -1197,7 +1218,7 @@
                   <pic:spPr>
                     <a:xfrm>
                       <a:off x="0" y="0"/>
-                      <a:ext cx="5400000" cy="2442962"/>
+                      <a:ext cx="5400000" cy="2121754"/>
                     </a:xfrm>
                     <a:prstGeom prst="rect"/>
                   </pic:spPr>
@@ -2818,7 +2839,7 @@
           </w:tcPr>
           <w:p>
             <w:r>
-              <w:t xml:space="preserve">Subimos una versión vieja de requests y Trivy lo bloquea.</w:t>
+              <w:t xml:space="preserve">Subimos una versión vieja de urllib3 y Trivy lo bloquea.</w:t>
             </w:r>
           </w:p>
         </w:tc>
@@ -2910,7 +2931,113 @@
     <w:p>
       <w:r>
         <w:rPr/>
-        <w:t>Cosas que tenemos que cuidar: la primera vez el pipeline tarda más porque descarga las herramientas, entonces vamos a dejar una corrida reciente abierta por si el internet del salón está lento. Los ejemplos que fallan los vamos a hacer en una rama aparte con pull request, para que se vea que no llega ni a construirse.</w:t>
+        <w:t>Los dos ejemplos que fallan ya están preparados en ramas aparte del repositorio, demo/dependencia y demo/secreto. En esas ramas el pipeline corre igual, pero nunca despliega, porque solo main llega a la farmacia. Las probamos antes de este informe y las dos se bloquean:</w:t>
+      </w:r>
+    </w:p>
+    <w:p>
+      <w:pPr>
+        <w:jc w:val="center"/>
+      </w:pPr>
+      <w:r>
+        <w:drawing>
+          <wp:inline xmlns:a="http://schemas.openxmlformats.org/drawingml/2006/main" xmlns:pic="http://schemas.openxmlformats.org/drawingml/2006/picture">
+            <wp:extent cx="5400000" cy="1828125"/>
+            <wp:docPr id="3" name="Picture 3"/>
+            <wp:cNvGraphicFramePr>
+              <a:graphicFrameLocks noChangeAspect="1"/>
+            </wp:cNvGraphicFramePr>
+            <a:graphic>
+              <a:graphicData uri="http://schemas.openxmlformats.org/drawingml/2006/picture">
+                <pic:pic>
+                  <pic:nvPicPr>
+                    <pic:cNvPr id="0" name="demo_dependencia.jpg"/>
+                    <pic:cNvPicPr/>
+                  </pic:nvPicPr>
+                  <pic:blipFill>
+                    <a:blip r:embed="rId9"/>
+                    <a:stretch>
+                      <a:fillRect/>
+                    </a:stretch>
+                  </pic:blipFill>
+                  <pic:spPr>
+                    <a:xfrm>
+                      <a:off x="0" y="0"/>
+                      <a:ext cx="5400000" cy="1828125"/>
+                    </a:xfrm>
+                    <a:prstGeom prst="rect"/>
+                  </pic:spPr>
+                </pic:pic>
+              </a:graphicData>
+            </a:graphic>
+          </wp:inline>
+        </w:drawing>
+      </w:r>
+    </w:p>
+    <w:p>
+      <w:pPr>
+        <w:jc w:val="center"/>
+      </w:pPr>
+      <w:r>
+        <w:rPr>
+          <w:i/>
+        </w:rPr>
+        <w:t>Rama demo/dependencia: Trivy encuentra la librería vulnerable y no se construye la imagen</w:t>
+      </w:r>
+    </w:p>
+    <w:p>
+      <w:pPr>
+        <w:jc w:val="center"/>
+      </w:pPr>
+      <w:r>
+        <w:drawing>
+          <wp:inline xmlns:a="http://schemas.openxmlformats.org/drawingml/2006/main" xmlns:pic="http://schemas.openxmlformats.org/drawingml/2006/picture">
+            <wp:extent cx="5400000" cy="1828125"/>
+            <wp:docPr id="4" name="Picture 4"/>
+            <wp:cNvGraphicFramePr>
+              <a:graphicFrameLocks noChangeAspect="1"/>
+            </wp:cNvGraphicFramePr>
+            <a:graphic>
+              <a:graphicData uri="http://schemas.openxmlformats.org/drawingml/2006/picture">
+                <pic:pic>
+                  <pic:nvPicPr>
+                    <pic:cNvPr id="0" name="demo_secreto.jpg"/>
+                    <pic:cNvPicPr/>
+                  </pic:nvPicPr>
+                  <pic:blipFill>
+                    <a:blip r:embed="rId10"/>
+                    <a:stretch>
+                      <a:fillRect/>
+                    </a:stretch>
+                  </pic:blipFill>
+                  <pic:spPr>
+                    <a:xfrm>
+                      <a:off x="0" y="0"/>
+                      <a:ext cx="5400000" cy="1828125"/>
+                    </a:xfrm>
+                    <a:prstGeom prst="rect"/>
+                  </pic:spPr>
+                </pic:pic>
+              </a:graphicData>
+            </a:graphic>
+          </wp:inline>
+        </w:drawing>
+      </w:r>
+    </w:p>
+    <w:p>
+      <w:pPr>
+        <w:jc w:val="center"/>
+      </w:pPr>
+      <w:r>
+        <w:rPr>
+          <w:i/>
+        </w:rPr>
+        <w:t>Rama demo/secreto: Gitleaks encuentra la llave en el código</w:t>
+      </w:r>
+    </w:p>
+    <w:p>
+      <w:r>
+        <w:rPr/>
+        <w:t>Cosas que tenemos que cuidar: la primera vez el pipeline tarda más porque descarga las herramientas, entonces vamos a dejar una corrida reciente abierta por si el internet del salón está lento.</w:t>
       </w:r>
     </w:p>
     <w:p/>
@@ -2936,7 +3063,7 @@
         <w:drawing>
           <wp:inline xmlns:a="http://schemas.openxmlformats.org/drawingml/2006/main" xmlns:pic="http://schemas.openxmlformats.org/drawingml/2006/picture">
             <wp:extent cx="5400000" cy="2443359"/>
-            <wp:docPr id="3" name="Picture 3"/>
+            <wp:docPr id="5" name="Picture 5"/>
             <wp:cNvGraphicFramePr>
               <a:graphicFrameLocks noChangeAspect="1"/>
             </wp:cNvGraphicFramePr>
@@ -2948,7 +3075,7 @@
                     <pic:cNvPicPr/>
                   </pic:nvPicPr>
                   <pic:blipFill>
-                    <a:blip r:embed="rId9"/>
+                    <a:blip r:embed="rId11"/>
                     <a:stretch>
                       <a:fillRect/>
                     </a:stretch>
@@ -2976,6 +3103,12 @@
           <w:i/>
         </w:rPr>
         <w:t>Primera corrida: fallan las pruebas y el despliegue no se ejecuta</w:t>
+      </w:r>
+    </w:p>
+    <w:p>
+      <w:r>
+        <w:rPr/>
+        <w:t>También nos pasó algo al preparar la demo. Gitleaks revisaba todas las ramas del repositorio, entonces cuando subimos la rama con la llave falsa se puso en rojo también main. Lo corregimos para que solo revise el historial de la rama que se está probando.</w:t>
       </w:r>
     </w:p>
     <w:p/>
@@ -3346,7 +3479,10 @@
     </w:p>
     <w:p>
       <w:pPr>
-        <w:pStyle w:val="Prrafodelista"/>
+        <w:numPr>
+          <w:ilvl w:val="0"/>
+          <w:numId w:val="2"/>
+        </w:numPr>
       </w:pPr>
       <w:r>
         <w:t>Diagrama C4 nivel contenedor con el caso de la farmacia.</w:t>
@@ -3354,7 +3490,10 @@
     </w:p>
     <w:p>
       <w:pPr>
-        <w:pStyle w:val="Prrafodelista"/>
+        <w:numPr>
+          <w:ilvl w:val="0"/>
+          <w:numId w:val="2"/>
+        </w:numPr>
       </w:pPr>
       <w:r>
         <w:t>Terminar el plan de calidad con métricas (por ejemplo, tiempo del pipeline y cobertura de pruebas).</w:t>
@@ -3362,23 +3501,21 @@
     </w:p>
     <w:p>
       <w:pPr>
-        <w:pStyle w:val="Prrafodelista"/>
+        <w:numPr>
+          <w:ilvl w:val="0"/>
+          <w:numId w:val="2"/>
+        </w:numPr>
       </w:pPr>
       <w:r>
-        <w:t>Preparar las ramas de la demo con la librería vulnerable y la llave falsa.</w:t>
+        <w:t>Dejar el sistema publicado con una dirección pública.</w:t>
       </w:r>
     </w:p>
     <w:p>
       <w:pPr>
-        <w:pStyle w:val="Prrafodelista"/>
-      </w:pPr>
-      <w:r>
-        <w:t>Dejar el sistema publicado con una dirección pública.</w:t>
-      </w:r>
-    </w:p>
-    <w:p>
-      <w:pPr>
-        <w:pStyle w:val="Prrafodelista"/>
+        <w:numPr>
+          <w:ilvl w:val="0"/>
+          <w:numId w:val="2"/>
+        </w:numPr>
       </w:pPr>
       <w:r>
         <w:t>Diapositivas y ensayar con el tiempo.</w:t>
@@ -3396,7 +3533,7 @@
     <w:p>
       <w:r>
         <w:rPr/>
-        <w:t>Usamos IA como ayuda para revisar la configuración del pipeline en GitHub Actions, resolver errores y ordenar la redacción. El caso, los requisitos y las herramientas los escogimos nosotros, y todo lo probamos antes de subirlo.</w:t>
+        <w:t>Usamos IA (Claude) como herramienta de apoyo para generar una primera versión del código de la API, la pantalla y la configuración del pipeline, y para ordenar la redacción de este informe. El replanteo del caso a partir de la retroalimentación del Hito 1, los requisitos y las herramientas del pipeline salen de lo que trabajamos como equipo. Corrimos y probamos todo antes de entregarlo, y cada integrante va a poder explicar su parte sin la IA.</w:t>
       </w:r>
     </w:p>
     <w:p/>
@@ -3410,7 +3547,10 @@
     </w:p>
     <w:p>
       <w:pPr>
-        <w:pStyle w:val="Prrafodelista"/>
+        <w:numPr>
+          <w:ilvl w:val="0"/>
+          <w:numId w:val="2"/>
+        </w:numPr>
       </w:pPr>
       <w:r>
         <w:t>OWASP Foundation. (2021). OWASP Top 10:2021. https://owasp.org/Top10/</w:t>
@@ -3418,7 +3558,10 @@
     </w:p>
     <w:p>
       <w:pPr>
-        <w:pStyle w:val="Prrafodelista"/>
+        <w:numPr>
+          <w:ilvl w:val="0"/>
+          <w:numId w:val="2"/>
+        </w:numPr>
       </w:pPr>
       <w:r>
         <w:t>ISO/IEC 25010:2023. Systems and software engineering - Product quality model.</w:t>
@@ -3426,7 +3569,10 @@
     </w:p>
     <w:p>
       <w:pPr>
-        <w:pStyle w:val="Prrafodelista"/>
+        <w:numPr>
+          <w:ilvl w:val="0"/>
+          <w:numId w:val="2"/>
+        </w:numPr>
       </w:pPr>
       <w:r>
         <w:t>GitHub. Documentación de GitHub Actions. https://docs.github.com/actions</w:t>
@@ -3434,7 +3580,10 @@
     </w:p>
     <w:p>
       <w:pPr>
-        <w:pStyle w:val="Prrafodelista"/>
+        <w:numPr>
+          <w:ilvl w:val="0"/>
+          <w:numId w:val="2"/>
+        </w:numPr>
       </w:pPr>
       <w:r>
         <w:t>Aqua Security. Documentación de Trivy. https://trivy.dev</w:t>
@@ -3442,7 +3591,10 @@
     </w:p>
     <w:p>
       <w:pPr>
-        <w:pStyle w:val="Prrafodelista"/>
+        <w:numPr>
+          <w:ilvl w:val="0"/>
+          <w:numId w:val="2"/>
+        </w:numPr>
       </w:pPr>
       <w:r>
         <w:t>Semgrep. Documentación. https://semgrep.dev/docs</w:t>
@@ -3450,7 +3602,10 @@
     </w:p>
     <w:p>
       <w:pPr>
-        <w:pStyle w:val="Prrafodelista"/>
+        <w:numPr>
+          <w:ilvl w:val="0"/>
+          <w:numId w:val="2"/>
+        </w:numPr>
       </w:pPr>
       <w:r>
         <w:t>Gitleaks. https://github.com/gitleaks/gitleaks</w:t>
@@ -3458,7 +3613,10 @@
     </w:p>
     <w:p>
       <w:pPr>
-        <w:pStyle w:val="Prrafodelista"/>
+        <w:numPr>
+          <w:ilvl w:val="0"/>
+          <w:numId w:val="2"/>
+        </w:numPr>
       </w:pPr>
       <w:r>
         <w:t>Tabler. Plantilla de interfaz. https://tabler.io</w:t>

</xml_diff>

<commit_message>
Informe: errores encontrados en las pruebas y su arreglo
</commit_message>
<xml_diff>
--- a/docs/Hito2_Grupo04_DevSecOps.docx
+++ b/docs/Hito2_Grupo04_DevSecOps.docx
@@ -1243,7 +1243,7 @@
     <w:p>
       <w:r>
         <w:rPr/>
-        <w:t>La API tiene 12 pruebas automáticas que revisan los casos de los requisitos: venta normal, total manipulado, controlado con y sin receta, sin existencias, teléfono tapado y acceso sin llave.</w:t>
+        <w:t>La API tiene 14 pruebas automáticas que revisan los casos de los requisitos: venta normal, total manipulado, controlado con y sin receta, sin existencias, teléfono tapado, acceso sin llave, productos repetidos en el mismo pedido y ventas al mismo tiempo.</w:t>
       </w:r>
     </w:p>
     <w:p/>
@@ -1485,7 +1485,7 @@
           </w:tcPr>
           <w:p>
             <w:r>
-              <w:t xml:space="preserve">Que las 12 pruebas pasen.</w:t>
+              <w:t xml:space="preserve">Que las 14 pruebas pasen.</w:t>
             </w:r>
           </w:p>
         </w:tc>
@@ -3109,6 +3109,51 @@
       <w:r>
         <w:rPr/>
         <w:t>También nos pasó algo al preparar la demo. Gitleaks revisaba todas las ramas del repositorio, entonces cuando subimos la rama con la llave falsa se puso en rojo también main. Lo corregimos para que solo revise el historial de la rama que se está probando.</w:t>
+      </w:r>
+    </w:p>
+    <w:p>
+      <w:r>
+        <w:rPr/>
+        <w:t>Por último, al probar el prototipo como si fuéramos la farmacia encontramos tres errores que las pruebas no cubrían:</w:t>
+      </w:r>
+    </w:p>
+    <w:p>
+      <w:pPr>
+        <w:numPr>
+          <w:ilvl w:val="0"/>
+          <w:numId w:val="2"/>
+        </w:numPr>
+      </w:pPr>
+      <w:r>
+        <w:t>Si el mismo medicamento venía dos veces en un pedido (7 y 7 de clonazepam con 12 en existencia), cada línea se revisaba por separado, las dos pasaban y el inventario quedaba en -2. Ahora se suman las cantidades del mismo producto antes de revisar.</w:t>
+      </w:r>
+    </w:p>
+    <w:p>
+      <w:pPr>
+        <w:numPr>
+          <w:ilvl w:val="0"/>
+          <w:numId w:val="2"/>
+        </w:numPr>
+      </w:pPr>
+      <w:r>
+        <w:t>Con 15 pedidos al mismo tiempo sobre 10 unidades, los 15 se aprobaban y el inventario quedaba en -5, porque todos leían la existencia antes de que alguno la descontara. Ahora la venta bloquea la base mientras revisa y descuenta, y la resta solo se hace si todavía alcanza.</w:t>
+      </w:r>
+    </w:p>
+    <w:p>
+      <w:pPr>
+        <w:numPr>
+          <w:ilvl w:val="0"/>
+          <w:numId w:val="2"/>
+        </w:numPr>
+      </w:pPr>
+      <w:r>
+        <w:t>Al registrar, el mensaje de confirmación se borraba de inmediato. La dependiente no veía nada, volvía a darle clic y se creaban dos pedidos iguales. Ahora el mensaje se queda debajo del botón y el botón se desactiva mientras se guarda.</w:t>
+      </w:r>
+    </w:p>
+    <w:p>
+      <w:r>
+        <w:rPr/>
+        <w:t>Para los dos primeros agregamos pruebas automáticas. Comprobamos que con el código anterior fallan y con el arreglo pasan, así que si alguien vuelve a meter el error, el pipeline lo detiene.</w:t>
       </w:r>
     </w:p>
     <w:p/>

</xml_diff>

<commit_message>
Agregar a Ricardo Guerra en integrantes
</commit_message>
<xml_diff>
--- a/docs/Hito2_Grupo04_DevSecOps.docx
+++ b/docs/Hito2_Grupo04_DevSecOps.docx
@@ -64,6 +64,12 @@
       <w:r>
         <w:rPr/>
         <w:t>Walter Herrera 1109722</w:t>
+      </w:r>
+    </w:p>
+    <w:p>
+      <w:r>
+        <w:rPr/>
+        <w:t>Ricardo Guerra 1234123</w:t>
       </w:r>
     </w:p>
     <w:p/>

</xml_diff>